<commit_message>
Release 0.7.3: GitLab automation, beta/LAN release channels, bloodstone-qt naming
</commit_message>
<xml_diff>
--- a/docs/Bloodstone-Blurt-S3-Mesh-Integration-Operations-Guide.docx
+++ b/docs/Bloodstone-Blurt-S3-Mesh-Integration-Operations-Guide.docx
@@ -1042,7 +1042,7 @@
         <w:spacing w:after="160"/>
       </w:pPr>
       <w:r>
-        <w:t xml:space="preserve">The coordinator issues one partner publish token for Blurt bulk operations. Treat it as a password — it allows chunk upload and manifest publish on keys under assets/blurt/.</w:t>
+        <w:t xml:space="preserve">The coordinator issues one partner publish token for Blurt bulk operations. Bloodstone delivers it out-of-band (not in this public operations guide). Treat it as a password — it allows chunk upload and manifest publish on keys under assets/blurt/.</w:t>
       </w:r>
     </w:p>
     <w:p>
@@ -1050,7 +1050,7 @@
         <w:pStyle w:val="Heading3"/>
       </w:pPr>
       <w:r>
-        <w:t xml:space="preserve">Token value</w:t>
+        <w:t xml:space="preserve">Token placeholder (replace with your issued secret)</w:t>
       </w:r>
     </w:p>
     <w:p>
@@ -1063,7 +1063,7 @@
           <w:sz w:val="20"/>
           <w:szCs w:val="20"/>
         </w:rPr>
-        <w:t xml:space="preserve">40948527d4bc3687cfcf80bff57d0de35ae79ab93edf3323469da650fb73080a</w:t>
+        <w:t xml:space="preserve">&lt;your-partner-token-from-bloodstone-ops&gt;</w:t>
       </w:r>
     </w:p>
     <w:p>
@@ -2542,7 +2542,7 @@
           <w:sz w:val="20"/>
           <w:szCs w:val="20"/>
         </w:rPr>
-        <w:t xml:space="preserve">export CHAIN_MESH_PUBLISH_TOKEN=40948527d4bc3687cfcf80bff57d0de35ae79ab93edf3323469da650fb73080a</w:t>
+        <w:t xml:space="preserve">export CHAIN_MESH_PUBLISH_TOKEN=&lt;your-partner-token-from-bloodstone-ops&gt;</w:t>
       </w:r>
     </w:p>
     <w:p>
@@ -3136,7 +3136,7 @@
       <w:pPr>
         <w:spacing w:after="120"/>
       </w:pPr>
-      <w:hyperlink w:history="1" r:id="rId__j7o6w9xc5u7mo_me6kn">
+      <w:hyperlink w:history="1" r:id="rIdk4d-nk6lpmhjns8khzgwt">
         <w:r>
           <w:rPr>
             <w:rStyle w:val="Hyperlink"/>
@@ -5193,7 +5193,7 @@
       <w:pPr>
         <w:spacing w:after="120"/>
       </w:pPr>
-      <w:hyperlink w:history="1" r:id="rId9kmqiztc4-_jnz_powdcf">
+      <w:hyperlink w:history="1" r:id="rId9jqjpxebqvnj8cf4sje6d">
         <w:r>
           <w:rPr>
             <w:rStyle w:val="Hyperlink"/>
@@ -6893,7 +6893,7 @@
       <w:pPr>
         <w:spacing w:after="120"/>
       </w:pPr>
-      <w:hyperlink w:history="1" r:id="rIde5ravkf0jc6ifyoztgjk-">
+      <w:hyperlink w:history="1" r:id="rIdbr_xlqhvr79xzwugojg75">
         <w:r>
           <w:rPr>
             <w:rStyle w:val="Hyperlink"/>
@@ -6906,7 +6906,7 @@
       <w:pPr>
         <w:spacing w:after="120"/>
       </w:pPr>
-      <w:hyperlink w:history="1" r:id="rId5slzb9eugqpnyizkgzmj-">
+      <w:hyperlink w:history="1" r:id="rIdsipgl5bgezlvbjomvzerp">
         <w:r>
           <w:rPr>
             <w:rStyle w:val="Hyperlink"/>
@@ -6919,7 +6919,7 @@
       <w:pPr>
         <w:spacing w:after="120"/>
       </w:pPr>
-      <w:hyperlink w:history="1" r:id="rIdcz1_gcjkgagf04hd2lmw6">
+      <w:hyperlink w:history="1" r:id="rIdjnb2iul3fr8jswfkxzyya">
         <w:r>
           <w:rPr>
             <w:rStyle w:val="Hyperlink"/>

</xml_diff>